<commit_message>
Atualiza Info 1214 STF e Info 887 STJ
</commit_message>
<xml_diff>
--- a/fluxo definitivo seguro (projeto-cópia).docx
+++ b/fluxo definitivo seguro (projeto-cópia).docx
@@ -6,27 +6,6 @@
       <w:pPr>
         <w:spacing w:before="100" w:beforeAutospacing="1" w:after="100" w:afterAutospacing="1" w:line="240" w:lineRule="auto"/>
         <w:jc w:val="left"/>
-        <w:rPr>
-          <w:rFonts w:ascii="Times New Roman" w:eastAsia="Times New Roman" w:hAnsi="Times New Roman" w:cs="Times New Roman"/>
-          <w:sz w:val="24"/>
-          <w:szCs w:val="24"/>
-          <w:lang w:eastAsia="pt-BR"/>
-        </w:rPr>
-      </w:pPr>
-      <w:r>
-        <w:rPr>
-          <w:rFonts w:ascii="Times New Roman" w:eastAsia="Times New Roman" w:hAnsi="Times New Roman" w:cs="Times New Roman"/>
-          <w:sz w:val="24"/>
-          <w:szCs w:val="24"/>
-          <w:lang w:eastAsia="pt-BR"/>
-        </w:rPr>
-        <w:t>Agora o fluxo definitivo ficou assim:</w:t>
-      </w:r>
-    </w:p>
-    <w:p>
-      <w:pPr>
-        <w:spacing w:before="100" w:beforeAutospacing="1" w:after="100" w:afterAutospacing="1" w:line="240" w:lineRule="auto"/>
-        <w:jc w:val="left"/>
         <w:outlineLvl w:val="1"/>
         <w:rPr>
           <w:rFonts w:ascii="Times New Roman" w:eastAsia="Times New Roman" w:hAnsi="Times New Roman" w:cs="Times New Roman"/>
@@ -39,25 +18,14 @@
       </w:pPr>
       <w:r>
         <w:rPr>
-          <w:rFonts w:ascii="Apple Color Emoji" w:eastAsia="Times New Roman" w:hAnsi="Apple Color Emoji" w:cs="Apple Color Emoji"/>
+          <w:rFonts w:ascii="Times New Roman" w:eastAsia="Times New Roman" w:hAnsi="Times New Roman" w:cs="Times New Roman"/>
           <w:b/>
           <w:bCs/>
           <w:sz w:val="36"/>
           <w:szCs w:val="36"/>
           <w:lang w:eastAsia="pt-BR"/>
         </w:rPr>
-        <w:t>✅</w:t>
-      </w:r>
-      <w:r>
-        <w:rPr>
-          <w:rFonts w:ascii="Times New Roman" w:eastAsia="Times New Roman" w:hAnsi="Times New Roman" w:cs="Times New Roman"/>
-          <w:b/>
-          <w:bCs/>
-          <w:sz w:val="36"/>
-          <w:szCs w:val="36"/>
-          <w:lang w:eastAsia="pt-BR"/>
-        </w:rPr>
-        <w:t xml:space="preserve"> FLUXO DEFINITIVO ATUAL</w:t>
+        <w:t>Fluxo definitivo — versão ajustada ao seu projeto atual</w:t>
       </w:r>
     </w:p>
     <w:p>
@@ -83,7 +51,7 @@
           <w:szCs w:val="27"/>
           <w:lang w:eastAsia="pt-BR"/>
         </w:rPr>
-        <w:t>1. Gerar/atualizar a base de questões</w:t>
+        <w:t>1. Atualizar a base de questões</w:t>
       </w:r>
     </w:p>
     <w:p>
@@ -104,7 +72,7 @@
           <w:szCs w:val="24"/>
           <w:lang w:eastAsia="pt-BR"/>
         </w:rPr>
-        <w:t>Quando for rodar o pipeline completo:</w:t>
+        <w:t>Quando quiser rodar tudo:</w:t>
       </w:r>
     </w:p>
     <w:p>
@@ -164,76 +132,7 @@
           <w:szCs w:val="24"/>
           <w:lang w:eastAsia="pt-BR"/>
         </w:rPr>
-        <w:t xml:space="preserve">Ou, se você já corrigiu manualmente </w:t>
-      </w:r>
-      <w:r>
-        <w:rPr>
-          <w:rFonts w:ascii="Courier New" w:eastAsia="Times New Roman" w:hAnsi="Courier New" w:cs="Courier New"/>
-          <w:sz w:val="20"/>
-          <w:szCs w:val="20"/>
-          <w:lang w:eastAsia="pt-BR"/>
-        </w:rPr>
-        <w:t>data/questoes.json</w:t>
-      </w:r>
-      <w:r>
-        <w:rPr>
-          <w:rFonts w:ascii="Times New Roman" w:eastAsia="Times New Roman" w:hAnsi="Times New Roman" w:cs="Times New Roman"/>
-          <w:sz w:val="24"/>
-          <w:szCs w:val="24"/>
-          <w:lang w:eastAsia="pt-BR"/>
-        </w:rPr>
-        <w:t>, pule esta etapa.</w:t>
-      </w:r>
-    </w:p>
-    <w:p>
-      <w:pPr>
-        <w:spacing w:after="0" w:line="240" w:lineRule="auto"/>
-        <w:jc w:val="left"/>
-        <w:rPr>
-          <w:rFonts w:ascii="Times New Roman" w:eastAsia="Times New Roman" w:hAnsi="Times New Roman" w:cs="Times New Roman"/>
-          <w:sz w:val="24"/>
-          <w:szCs w:val="24"/>
-          <w:lang w:eastAsia="pt-BR"/>
-        </w:rPr>
-      </w:pPr>
-      <w:r>
-        <w:rPr>
-          <w:rFonts w:ascii="Times New Roman" w:eastAsia="Times New Roman" w:hAnsi="Times New Roman" w:cs="Times New Roman"/>
-          <w:noProof/>
-          <w:sz w:val="24"/>
-          <w:szCs w:val="24"/>
-          <w:lang w:eastAsia="pt-BR"/>
-          <w14:ligatures w14:val="standardContextual"/>
-        </w:rPr>
-        <w:pict w14:anchorId="2B735A89">
-          <v:rect id="_x0000_i1029" alt="" style="width:425.2pt;height:.05pt;mso-width-percent:0;mso-height-percent:0;mso-width-percent:0;mso-height-percent:0" o:hralign="center" o:hrstd="t" o:hr="t" fillcolor="#a0a0a0" stroked="f"/>
-        </w:pict>
-      </w:r>
-    </w:p>
-    <w:p>
-      <w:pPr>
-        <w:spacing w:before="100" w:beforeAutospacing="1" w:after="100" w:afterAutospacing="1" w:line="240" w:lineRule="auto"/>
-        <w:jc w:val="left"/>
-        <w:outlineLvl w:val="2"/>
-        <w:rPr>
-          <w:rFonts w:ascii="Times New Roman" w:eastAsia="Times New Roman" w:hAnsi="Times New Roman" w:cs="Times New Roman"/>
-          <w:b/>
-          <w:bCs/>
-          <w:sz w:val="27"/>
-          <w:szCs w:val="27"/>
-          <w:lang w:eastAsia="pt-BR"/>
-        </w:rPr>
-      </w:pPr>
-      <w:r>
-        <w:rPr>
-          <w:rFonts w:ascii="Times New Roman" w:eastAsia="Times New Roman" w:hAnsi="Times New Roman" w:cs="Times New Roman"/>
-          <w:b/>
-          <w:bCs/>
-          <w:sz w:val="27"/>
-          <w:szCs w:val="27"/>
-          <w:lang w:eastAsia="pt-BR"/>
-        </w:rPr>
-        <w:t>2. Validar antes de publicar</w:t>
+        <w:t>Ou, se você já editou/corrigiu manualmente:</w:t>
       </w:r>
     </w:p>
     <w:p>
@@ -272,7 +171,7 @@
           <w:szCs w:val="20"/>
           <w:lang w:eastAsia="pt-BR"/>
         </w:rPr>
-        <w:t>python3 validar_site.py</w:t>
+        <w:t>data/questoes.json</w:t>
       </w:r>
     </w:p>
     <w:p>
@@ -293,7 +192,79 @@
           <w:szCs w:val="24"/>
           <w:lang w:eastAsia="pt-BR"/>
         </w:rPr>
-        <w:t>Só continue se aparecer:</w:t>
+        <w:t>pule essa etapa.</w:t>
+      </w:r>
+    </w:p>
+    <w:p>
+      <w:pPr>
+        <w:spacing w:after="0" w:line="240" w:lineRule="auto"/>
+        <w:jc w:val="left"/>
+        <w:rPr>
+          <w:rFonts w:ascii="Times New Roman" w:eastAsia="Times New Roman" w:hAnsi="Times New Roman" w:cs="Times New Roman"/>
+          <w:sz w:val="24"/>
+          <w:szCs w:val="24"/>
+          <w:lang w:eastAsia="pt-BR"/>
+        </w:rPr>
+      </w:pPr>
+      <w:r>
+        <w:rPr>
+          <w:rFonts w:ascii="Times New Roman" w:eastAsia="Times New Roman" w:hAnsi="Times New Roman" w:cs="Times New Roman"/>
+          <w:noProof/>
+          <w:sz w:val="24"/>
+          <w:szCs w:val="24"/>
+          <w:lang w:eastAsia="pt-BR"/>
+          <w14:ligatures w14:val="standardContextual"/>
+        </w:rPr>
+        <w:pict w14:anchorId="133B5108">
+          <v:rect id="_x0000_i1035" alt="" style="width:425.2pt;height:.05pt;mso-width-percent:0;mso-height-percent:0;mso-width-percent:0;mso-height-percent:0" o:hralign="center" o:hrstd="t" o:hr="t" fillcolor="#a0a0a0" stroked="f"/>
+        </w:pict>
+      </w:r>
+    </w:p>
+    <w:p>
+      <w:pPr>
+        <w:spacing w:before="100" w:beforeAutospacing="1" w:after="100" w:afterAutospacing="1" w:line="240" w:lineRule="auto"/>
+        <w:jc w:val="left"/>
+        <w:outlineLvl w:val="2"/>
+        <w:rPr>
+          <w:rFonts w:ascii="Times New Roman" w:eastAsia="Times New Roman" w:hAnsi="Times New Roman" w:cs="Times New Roman"/>
+          <w:b/>
+          <w:bCs/>
+          <w:sz w:val="27"/>
+          <w:szCs w:val="27"/>
+          <w:lang w:eastAsia="pt-BR"/>
+        </w:rPr>
+      </w:pPr>
+      <w:r>
+        <w:rPr>
+          <w:rFonts w:ascii="Times New Roman" w:eastAsia="Times New Roman" w:hAnsi="Times New Roman" w:cs="Times New Roman"/>
+          <w:b/>
+          <w:bCs/>
+          <w:sz w:val="27"/>
+          <w:szCs w:val="27"/>
+          <w:lang w:eastAsia="pt-BR"/>
+        </w:rPr>
+        <w:t>2. Preparar o site para GitHub Pages</w:t>
+      </w:r>
+    </w:p>
+    <w:p>
+      <w:pPr>
+        <w:spacing w:before="100" w:beforeAutospacing="1" w:after="100" w:afterAutospacing="1" w:line="240" w:lineRule="auto"/>
+        <w:jc w:val="left"/>
+        <w:rPr>
+          <w:rFonts w:ascii="Times New Roman" w:eastAsia="Times New Roman" w:hAnsi="Times New Roman" w:cs="Times New Roman"/>
+          <w:sz w:val="24"/>
+          <w:szCs w:val="24"/>
+          <w:lang w:eastAsia="pt-BR"/>
+        </w:rPr>
+      </w:pPr>
+      <w:r>
+        <w:rPr>
+          <w:rFonts w:ascii="Times New Roman" w:eastAsia="Times New Roman" w:hAnsi="Times New Roman" w:cs="Times New Roman"/>
+          <w:sz w:val="24"/>
+          <w:szCs w:val="24"/>
+          <w:lang w:eastAsia="pt-BR"/>
+        </w:rPr>
+        <w:t>No seu projeto atual, o comando correto é:</w:t>
       </w:r>
     </w:p>
     <w:p>
@@ -327,26 +298,17 @@
       </w:pPr>
       <w:r>
         <w:rPr>
-          <w:rFonts w:ascii="Apple Color Emoji" w:eastAsia="Times New Roman" w:hAnsi="Apple Color Emoji" w:cs="Apple Color Emoji"/>
-          <w:sz w:val="20"/>
-          <w:szCs w:val="20"/>
-          <w:lang w:eastAsia="pt-BR"/>
-        </w:rPr>
-        <w:t>✅</w:t>
-      </w:r>
-      <w:r>
-        <w:rPr>
-          <w:rFonts w:ascii="Courier New" w:eastAsia="Times New Roman" w:hAnsi="Courier New" w:cs="Courier New"/>
-          <w:sz w:val="20"/>
-          <w:szCs w:val="20"/>
-          <w:lang w:eastAsia="pt-BR"/>
-        </w:rPr>
-        <w:t xml:space="preserve"> VALIDAÇÃO OK</w:t>
-      </w:r>
-    </w:p>
-    <w:p>
-      <w:pPr>
-        <w:spacing w:after="0" w:line="240" w:lineRule="auto"/>
+          <w:rFonts w:ascii="Courier New" w:eastAsia="Times New Roman" w:hAnsi="Courier New" w:cs="Courier New"/>
+          <w:sz w:val="20"/>
+          <w:szCs w:val="20"/>
+          <w:lang w:eastAsia="pt-BR"/>
+        </w:rPr>
+        <w:t>./preparar_docs_pages.sh</w:t>
+      </w:r>
+    </w:p>
+    <w:p>
+      <w:pPr>
+        <w:spacing w:before="100" w:beforeAutospacing="1" w:after="100" w:afterAutospacing="1" w:line="240" w:lineRule="auto"/>
         <w:jc w:val="left"/>
         <w:rPr>
           <w:rFonts w:ascii="Times New Roman" w:eastAsia="Times New Roman" w:hAnsi="Times New Roman" w:cs="Times New Roman"/>
@@ -358,14 +320,51 @@
       <w:r>
         <w:rPr>
           <w:rFonts w:ascii="Times New Roman" w:eastAsia="Times New Roman" w:hAnsi="Times New Roman" w:cs="Times New Roman"/>
-          <w:noProof/>
           <w:sz w:val="24"/>
           <w:szCs w:val="24"/>
           <w:lang w:eastAsia="pt-BR"/>
-          <w14:ligatures w14:val="standardContextual"/>
-        </w:rPr>
-        <w:pict w14:anchorId="15E73D15">
-          <v:rect id="_x0000_i1028" alt="" style="width:425.2pt;height:.05pt;mso-width-percent:0;mso-height-percent:0;mso-width-percent:0;mso-height-percent:0" o:hralign="center" o:hrstd="t" o:hr="t" fillcolor="#a0a0a0" stroked="f"/>
+        </w:rPr>
+        <w:t xml:space="preserve">Ele substitui aquele antigo </w:t>
+      </w:r>
+      <w:r>
+        <w:rPr>
+          <w:rFonts w:ascii="Courier New" w:eastAsia="Times New Roman" w:hAnsi="Courier New" w:cs="Courier New"/>
+          <w:sz w:val="20"/>
+          <w:szCs w:val="20"/>
+          <w:lang w:eastAsia="pt-BR"/>
+        </w:rPr>
+        <w:t>./build.sh</w:t>
+      </w:r>
+      <w:r>
+        <w:rPr>
+          <w:rFonts w:ascii="Times New Roman" w:eastAsia="Times New Roman" w:hAnsi="Times New Roman" w:cs="Times New Roman"/>
+          <w:sz w:val="24"/>
+          <w:szCs w:val="24"/>
+          <w:lang w:eastAsia="pt-BR"/>
+        </w:rPr>
+        <w:t>.</w:t>
+      </w:r>
+    </w:p>
+    <w:p>
+      <w:pPr>
+        <w:spacing w:after="0" w:line="240" w:lineRule="auto"/>
+        <w:jc w:val="left"/>
+        <w:rPr>
+          <w:rFonts w:ascii="Times New Roman" w:eastAsia="Times New Roman" w:hAnsi="Times New Roman" w:cs="Times New Roman"/>
+          <w:sz w:val="24"/>
+          <w:szCs w:val="24"/>
+          <w:lang w:eastAsia="pt-BR"/>
+        </w:rPr>
+      </w:pPr>
+      <w:r>
+        <w:rPr>
+          <w:rFonts w:ascii="Times New Roman" w:eastAsia="Times New Roman" w:hAnsi="Times New Roman" w:cs="Times New Roman"/>
+          <w:sz w:val="24"/>
+          <w:szCs w:val="24"/>
+          <w:lang w:eastAsia="pt-BR"/>
+        </w:rPr>
+        <w:pict w14:anchorId="445891B3">
+          <v:rect id="_x0000_i1031" style="width:0;height:1.5pt" o:hralign="center" o:hrstd="t" o:hr="t" fillcolor="#a0a0a0" stroked="f"/>
         </w:pict>
       </w:r>
     </w:p>
@@ -392,18 +391,7 @@
           <w:szCs w:val="27"/>
           <w:lang w:eastAsia="pt-BR"/>
         </w:rPr>
-        <w:t xml:space="preserve">3. Atualizar o site local e preparar </w:t>
-      </w:r>
-      <w:r>
-        <w:rPr>
-          <w:rFonts w:ascii="Courier New" w:eastAsia="Times New Roman" w:hAnsi="Courier New" w:cs="Courier New"/>
-          <w:b/>
-          <w:bCs/>
-          <w:sz w:val="20"/>
-          <w:szCs w:val="20"/>
-          <w:lang w:eastAsia="pt-BR"/>
-        </w:rPr>
-        <w:t>docs</w:t>
+        <w:t>3. Testar localmente</w:t>
       </w:r>
     </w:p>
     <w:p>
@@ -442,28 +430,7 @@
           <w:szCs w:val="20"/>
           <w:lang w:eastAsia="pt-BR"/>
         </w:rPr>
-        <w:t>./build.sh</w:t>
-      </w:r>
-    </w:p>
-    <w:p>
-      <w:pPr>
-        <w:spacing w:before="100" w:beforeAutospacing="1" w:after="100" w:afterAutospacing="1" w:line="240" w:lineRule="auto"/>
-        <w:jc w:val="left"/>
-        <w:rPr>
-          <w:rFonts w:ascii="Times New Roman" w:eastAsia="Times New Roman" w:hAnsi="Times New Roman" w:cs="Times New Roman"/>
-          <w:sz w:val="24"/>
-          <w:szCs w:val="24"/>
-          <w:lang w:eastAsia="pt-BR"/>
-        </w:rPr>
-      </w:pPr>
-      <w:r>
-        <w:rPr>
-          <w:rFonts w:ascii="Times New Roman" w:eastAsia="Times New Roman" w:hAnsi="Times New Roman" w:cs="Times New Roman"/>
-          <w:sz w:val="24"/>
-          <w:szCs w:val="24"/>
-          <w:lang w:eastAsia="pt-BR"/>
-        </w:rPr>
-        <w:t>Esse comando faz:</w:t>
+        <w:t>cd html_final</w:t>
       </w:r>
     </w:p>
     <w:p>
@@ -502,7 +469,28 @@
           <w:szCs w:val="20"/>
           <w:lang w:eastAsia="pt-BR"/>
         </w:rPr>
-        <w:t>valida JSON</w:t>
+        <w:t>python3 -m http.server 8000</w:t>
+      </w:r>
+    </w:p>
+    <w:p>
+      <w:pPr>
+        <w:spacing w:before="100" w:beforeAutospacing="1" w:after="100" w:afterAutospacing="1" w:line="240" w:lineRule="auto"/>
+        <w:jc w:val="left"/>
+        <w:rPr>
+          <w:rFonts w:ascii="Times New Roman" w:eastAsia="Times New Roman" w:hAnsi="Times New Roman" w:cs="Times New Roman"/>
+          <w:sz w:val="24"/>
+          <w:szCs w:val="24"/>
+          <w:lang w:eastAsia="pt-BR"/>
+        </w:rPr>
+      </w:pPr>
+      <w:r>
+        <w:rPr>
+          <w:rFonts w:ascii="Times New Roman" w:eastAsia="Times New Roman" w:hAnsi="Times New Roman" w:cs="Times New Roman"/>
+          <w:sz w:val="24"/>
+          <w:szCs w:val="24"/>
+          <w:lang w:eastAsia="pt-BR"/>
+        </w:rPr>
+        <w:t>Acesse:</w:t>
       </w:r>
     </w:p>
     <w:p>
@@ -541,7 +529,28 @@
           <w:szCs w:val="20"/>
           <w:lang w:eastAsia="pt-BR"/>
         </w:rPr>
-        <w:t>copia data/questoes.json → html_final/data/questoes.json</w:t>
+        <w:t>http://localhost:8000/index.html</w:t>
+      </w:r>
+    </w:p>
+    <w:p>
+      <w:pPr>
+        <w:spacing w:before="100" w:beforeAutospacing="1" w:after="100" w:afterAutospacing="1" w:line="240" w:lineRule="auto"/>
+        <w:jc w:val="left"/>
+        <w:rPr>
+          <w:rFonts w:ascii="Times New Roman" w:eastAsia="Times New Roman" w:hAnsi="Times New Roman" w:cs="Times New Roman"/>
+          <w:sz w:val="24"/>
+          <w:szCs w:val="24"/>
+          <w:lang w:eastAsia="pt-BR"/>
+        </w:rPr>
+      </w:pPr>
+      <w:r>
+        <w:rPr>
+          <w:rFonts w:ascii="Times New Roman" w:eastAsia="Times New Roman" w:hAnsi="Times New Roman" w:cs="Times New Roman"/>
+          <w:sz w:val="24"/>
+          <w:szCs w:val="24"/>
+          <w:lang w:eastAsia="pt-BR"/>
+        </w:rPr>
+        <w:t>Depois volte:</w:t>
       </w:r>
     </w:p>
     <w:p>
@@ -580,7 +589,56 @@
           <w:szCs w:val="20"/>
           <w:lang w:eastAsia="pt-BR"/>
         </w:rPr>
-        <w:t>prepara docs para GitHub Pages</w:t>
+        <w:t>cd ..</w:t>
+      </w:r>
+    </w:p>
+    <w:p>
+      <w:pPr>
+        <w:spacing w:after="0" w:line="240" w:lineRule="auto"/>
+        <w:jc w:val="left"/>
+        <w:rPr>
+          <w:rFonts w:ascii="Times New Roman" w:eastAsia="Times New Roman" w:hAnsi="Times New Roman" w:cs="Times New Roman"/>
+          <w:sz w:val="24"/>
+          <w:szCs w:val="24"/>
+          <w:lang w:eastAsia="pt-BR"/>
+        </w:rPr>
+      </w:pPr>
+      <w:r>
+        <w:rPr>
+          <w:rFonts w:ascii="Times New Roman" w:eastAsia="Times New Roman" w:hAnsi="Times New Roman" w:cs="Times New Roman"/>
+          <w:sz w:val="24"/>
+          <w:szCs w:val="24"/>
+          <w:lang w:eastAsia="pt-BR"/>
+        </w:rPr>
+        <w:pict w14:anchorId="14DA602A">
+          <v:rect id="_x0000_i1032" style="width:0;height:1.5pt" o:hralign="center" o:hrstd="t" o:hr="t" fillcolor="#a0a0a0" stroked="f"/>
+        </w:pict>
+      </w:r>
+    </w:p>
+    <w:p>
+      <w:pPr>
+        <w:spacing w:before="100" w:beforeAutospacing="1" w:after="100" w:afterAutospacing="1" w:line="240" w:lineRule="auto"/>
+        <w:jc w:val="left"/>
+        <w:outlineLvl w:val="2"/>
+        <w:rPr>
+          <w:rFonts w:ascii="Times New Roman" w:eastAsia="Times New Roman" w:hAnsi="Times New Roman" w:cs="Times New Roman"/>
+          <w:b/>
+          <w:bCs/>
+          <w:sz w:val="27"/>
+          <w:szCs w:val="27"/>
+          <w:lang w:eastAsia="pt-BR"/>
+        </w:rPr>
+      </w:pPr>
+      <w:r>
+        <w:rPr>
+          <w:rFonts w:ascii="Times New Roman" w:eastAsia="Times New Roman" w:hAnsi="Times New Roman" w:cs="Times New Roman"/>
+          <w:b/>
+          <w:bCs/>
+          <w:sz w:val="27"/>
+          <w:szCs w:val="27"/>
+          <w:lang w:eastAsia="pt-BR"/>
+        </w:rPr>
+        <w:t>4. Publicar no GitHub</w:t>
       </w:r>
     </w:p>
     <w:p>
@@ -619,58 +677,7 @@
           <w:szCs w:val="20"/>
           <w:lang w:eastAsia="pt-BR"/>
         </w:rPr>
-        <w:t>confere se docs/data/questoes.json está igual</w:t>
-      </w:r>
-    </w:p>
-    <w:p>
-      <w:pPr>
-        <w:spacing w:after="0" w:line="240" w:lineRule="auto"/>
-        <w:jc w:val="left"/>
-        <w:rPr>
-          <w:rFonts w:ascii="Times New Roman" w:eastAsia="Times New Roman" w:hAnsi="Times New Roman" w:cs="Times New Roman"/>
-          <w:sz w:val="24"/>
-          <w:szCs w:val="24"/>
-          <w:lang w:eastAsia="pt-BR"/>
-        </w:rPr>
-      </w:pPr>
-      <w:r>
-        <w:rPr>
-          <w:rFonts w:ascii="Times New Roman" w:eastAsia="Times New Roman" w:hAnsi="Times New Roman" w:cs="Times New Roman"/>
-          <w:noProof/>
-          <w:sz w:val="24"/>
-          <w:szCs w:val="24"/>
-          <w:lang w:eastAsia="pt-BR"/>
-          <w14:ligatures w14:val="standardContextual"/>
-        </w:rPr>
-        <w:pict w14:anchorId="57ABBC08">
-          <v:rect id="_x0000_i1027" alt="" style="width:425.2pt;height:.05pt;mso-width-percent:0;mso-height-percent:0;mso-width-percent:0;mso-height-percent:0" o:hralign="center" o:hrstd="t" o:hr="t" fillcolor="#a0a0a0" stroked="f"/>
-        </w:pict>
-      </w:r>
-    </w:p>
-    <w:p>
-      <w:pPr>
-        <w:spacing w:before="100" w:beforeAutospacing="1" w:after="100" w:afterAutospacing="1" w:line="240" w:lineRule="auto"/>
-        <w:jc w:val="left"/>
-        <w:outlineLvl w:val="2"/>
-        <w:rPr>
-          <w:rFonts w:ascii="Times New Roman" w:eastAsia="Times New Roman" w:hAnsi="Times New Roman" w:cs="Times New Roman"/>
-          <w:b/>
-          <w:bCs/>
-          <w:sz w:val="27"/>
-          <w:szCs w:val="27"/>
-          <w:lang w:eastAsia="pt-BR"/>
-        </w:rPr>
-      </w:pPr>
-      <w:r>
-        <w:rPr>
-          <w:rFonts w:ascii="Times New Roman" w:eastAsia="Times New Roman" w:hAnsi="Times New Roman" w:cs="Times New Roman"/>
-          <w:b/>
-          <w:bCs/>
-          <w:sz w:val="27"/>
-          <w:szCs w:val="27"/>
-          <w:lang w:eastAsia="pt-BR"/>
-        </w:rPr>
-        <w:t>4. Testar localmente</w:t>
+        <w:t>git add data/questoes.json html_final/data/questoes.json docs html_final/assets/app.js questoes_validadas_pdf md_criticos_reprocessados</w:t>
       </w:r>
     </w:p>
     <w:p>
@@ -709,7 +716,7 @@
           <w:szCs w:val="20"/>
           <w:lang w:eastAsia="pt-BR"/>
         </w:rPr>
-        <w:t>cd html_final</w:t>
+        <w:t>git commit -m "Atualiza site com base validada"</w:t>
       </w:r>
     </w:p>
     <w:p>
@@ -748,12 +755,12 @@
           <w:szCs w:val="20"/>
           <w:lang w:eastAsia="pt-BR"/>
         </w:rPr>
-        <w:t>python3 -m http.server 8000</w:t>
-      </w:r>
-    </w:p>
-    <w:p>
-      <w:pPr>
-        <w:spacing w:before="100" w:beforeAutospacing="1" w:after="100" w:afterAutospacing="1" w:line="240" w:lineRule="auto"/>
+        <w:t>git push origin main</w:t>
+      </w:r>
+    </w:p>
+    <w:p>
+      <w:pPr>
+        <w:spacing w:after="0" w:line="240" w:lineRule="auto"/>
         <w:jc w:val="left"/>
         <w:rPr>
           <w:rFonts w:ascii="Times New Roman" w:eastAsia="Times New Roman" w:hAnsi="Times New Roman" w:cs="Times New Roman"/>
@@ -769,7 +776,35 @@
           <w:szCs w:val="24"/>
           <w:lang w:eastAsia="pt-BR"/>
         </w:rPr>
-        <w:t>Acesse:</w:t>
+        <w:pict w14:anchorId="18A7E076">
+          <v:rect id="_x0000_i1033" style="width:0;height:1.5pt" o:hralign="center" o:hrstd="t" o:hr="t" fillcolor="#a0a0a0" stroked="f"/>
+        </w:pict>
+      </w:r>
+    </w:p>
+    <w:p>
+      <w:pPr>
+        <w:spacing w:before="100" w:beforeAutospacing="1" w:after="100" w:afterAutospacing="1" w:line="240" w:lineRule="auto"/>
+        <w:jc w:val="left"/>
+        <w:outlineLvl w:val="1"/>
+        <w:rPr>
+          <w:rFonts w:ascii="Times New Roman" w:eastAsia="Times New Roman" w:hAnsi="Times New Roman" w:cs="Times New Roman"/>
+          <w:b/>
+          <w:bCs/>
+          <w:sz w:val="36"/>
+          <w:szCs w:val="36"/>
+          <w:lang w:eastAsia="pt-BR"/>
+        </w:rPr>
+      </w:pPr>
+      <w:r>
+        <w:rPr>
+          <w:rFonts w:ascii="Times New Roman" w:eastAsia="Times New Roman" w:hAnsi="Times New Roman" w:cs="Times New Roman"/>
+          <w:b/>
+          <w:bCs/>
+          <w:sz w:val="36"/>
+          <w:szCs w:val="36"/>
+          <w:lang w:eastAsia="pt-BR"/>
+        </w:rPr>
+        <w:t>Fluxo curto, para usar no dia a dia</w:t>
       </w:r>
     </w:p>
     <w:p>
@@ -808,28 +843,8 @@
           <w:szCs w:val="20"/>
           <w:lang w:eastAsia="pt-BR"/>
         </w:rPr>
-        <w:t>http://localhost:8000/index.html</w:t>
-      </w:r>
-    </w:p>
-    <w:p>
-      <w:pPr>
-        <w:spacing w:before="100" w:beforeAutospacing="1" w:after="100" w:afterAutospacing="1" w:line="240" w:lineRule="auto"/>
-        <w:jc w:val="left"/>
-        <w:rPr>
-          <w:rFonts w:ascii="Times New Roman" w:eastAsia="Times New Roman" w:hAnsi="Times New Roman" w:cs="Times New Roman"/>
-          <w:sz w:val="24"/>
-          <w:szCs w:val="24"/>
-          <w:lang w:eastAsia="pt-BR"/>
-        </w:rPr>
-      </w:pPr>
-      <w:r>
-        <w:rPr>
-          <w:rFonts w:ascii="Times New Roman" w:eastAsia="Times New Roman" w:hAnsi="Times New Roman" w:cs="Times New Roman"/>
-          <w:sz w:val="24"/>
-          <w:szCs w:val="24"/>
-          <w:lang w:eastAsia="pt-BR"/>
-        </w:rPr>
-        <w:t>Depois volte para a raiz:</w:t>
+        <w:lastRenderedPageBreak/>
+        <w:t>./preparar_docs_pages.sh</w:t>
       </w:r>
     </w:p>
     <w:p>
@@ -868,80 +883,7 @@
           <w:szCs w:val="20"/>
           <w:lang w:eastAsia="pt-BR"/>
         </w:rPr>
-        <w:t>cd ..</w:t>
-      </w:r>
-    </w:p>
-    <w:p>
-      <w:pPr>
-        <w:spacing w:after="0" w:line="240" w:lineRule="auto"/>
-        <w:jc w:val="left"/>
-        <w:rPr>
-          <w:rFonts w:ascii="Times New Roman" w:eastAsia="Times New Roman" w:hAnsi="Times New Roman" w:cs="Times New Roman"/>
-          <w:sz w:val="24"/>
-          <w:szCs w:val="24"/>
-          <w:lang w:eastAsia="pt-BR"/>
-        </w:rPr>
-      </w:pPr>
-      <w:r>
-        <w:rPr>
-          <w:rFonts w:ascii="Times New Roman" w:eastAsia="Times New Roman" w:hAnsi="Times New Roman" w:cs="Times New Roman"/>
-          <w:noProof/>
-          <w:sz w:val="24"/>
-          <w:szCs w:val="24"/>
-          <w:lang w:eastAsia="pt-BR"/>
-          <w14:ligatures w14:val="standardContextual"/>
-        </w:rPr>
-        <w:pict w14:anchorId="7DBEF1E8">
-          <v:rect id="_x0000_i1026" alt="" style="width:425.2pt;height:.05pt;mso-width-percent:0;mso-height-percent:0;mso-width-percent:0;mso-height-percent:0" o:hralign="center" o:hrstd="t" o:hr="t" fillcolor="#a0a0a0" stroked="f"/>
-        </w:pict>
-      </w:r>
-    </w:p>
-    <w:p>
-      <w:pPr>
-        <w:spacing w:before="100" w:beforeAutospacing="1" w:after="100" w:afterAutospacing="1" w:line="240" w:lineRule="auto"/>
-        <w:jc w:val="left"/>
-        <w:outlineLvl w:val="2"/>
-        <w:rPr>
-          <w:rFonts w:ascii="Times New Roman" w:eastAsia="Times New Roman" w:hAnsi="Times New Roman" w:cs="Times New Roman"/>
-          <w:b/>
-          <w:bCs/>
-          <w:sz w:val="27"/>
-          <w:szCs w:val="27"/>
-          <w:lang w:eastAsia="pt-BR"/>
-        </w:rPr>
-      </w:pPr>
-      <w:r>
-        <w:rPr>
-          <w:rFonts w:ascii="Times New Roman" w:eastAsia="Times New Roman" w:hAnsi="Times New Roman" w:cs="Times New Roman"/>
-          <w:b/>
-          <w:bCs/>
-          <w:sz w:val="27"/>
-          <w:szCs w:val="27"/>
-          <w:lang w:eastAsia="pt-BR"/>
-        </w:rPr>
-        <w:t>5. Publicar no GitHub</w:t>
-      </w:r>
-    </w:p>
-    <w:p>
-      <w:pPr>
-        <w:spacing w:before="100" w:beforeAutospacing="1" w:after="100" w:afterAutospacing="1" w:line="240" w:lineRule="auto"/>
-        <w:jc w:val="left"/>
-        <w:rPr>
-          <w:rFonts w:ascii="Times New Roman" w:eastAsia="Times New Roman" w:hAnsi="Times New Roman" w:cs="Times New Roman"/>
-          <w:sz w:val="24"/>
-          <w:szCs w:val="24"/>
-          <w:lang w:eastAsia="pt-BR"/>
-        </w:rPr>
-      </w:pPr>
-      <w:r>
-        <w:rPr>
-          <w:rFonts w:ascii="Times New Roman" w:eastAsia="Times New Roman" w:hAnsi="Times New Roman" w:cs="Times New Roman"/>
-          <w:sz w:val="24"/>
-          <w:szCs w:val="24"/>
-          <w:lang w:eastAsia="pt-BR"/>
-        </w:rPr>
-        <w:lastRenderedPageBreak/>
-        <w:t>Se o teste local estiver ok:</w:t>
+        <w:t>cd html_final</w:t>
       </w:r>
     </w:p>
     <w:p>
@@ -980,7 +922,28 @@
           <w:szCs w:val="20"/>
           <w:lang w:eastAsia="pt-BR"/>
         </w:rPr>
-        <w:t>git add data/questoes.json html_final/data/questoes.json html_final/assets/app.js docs questoes_validadas_pdf validar_site.py build.sh deploy_seguro.sh</w:t>
+        <w:t>python3 -m http.server 8000</w:t>
+      </w:r>
+    </w:p>
+    <w:p>
+      <w:pPr>
+        <w:spacing w:before="100" w:beforeAutospacing="1" w:after="100" w:afterAutospacing="1" w:line="240" w:lineRule="auto"/>
+        <w:jc w:val="left"/>
+        <w:rPr>
+          <w:rFonts w:ascii="Times New Roman" w:eastAsia="Times New Roman" w:hAnsi="Times New Roman" w:cs="Times New Roman"/>
+          <w:sz w:val="24"/>
+          <w:szCs w:val="24"/>
+          <w:lang w:eastAsia="pt-BR"/>
+        </w:rPr>
+      </w:pPr>
+      <w:r>
+        <w:rPr>
+          <w:rFonts w:ascii="Times New Roman" w:eastAsia="Times New Roman" w:hAnsi="Times New Roman" w:cs="Times New Roman"/>
+          <w:sz w:val="24"/>
+          <w:szCs w:val="24"/>
+          <w:lang w:eastAsia="pt-BR"/>
+        </w:rPr>
+        <w:t>Testou no navegador e está ok?</w:t>
       </w:r>
     </w:p>
     <w:p>
@@ -1019,7 +982,7 @@
           <w:szCs w:val="20"/>
           <w:lang w:eastAsia="pt-BR"/>
         </w:rPr>
-        <w:t>git commit -m "Atualiza site com base validada"</w:t>
+        <w:t>cd ..</w:t>
       </w:r>
     </w:p>
     <w:p>
@@ -1058,90 +1021,7 @@
           <w:szCs w:val="20"/>
           <w:lang w:eastAsia="pt-BR"/>
         </w:rPr>
-        <w:t>git push</w:t>
-      </w:r>
-    </w:p>
-    <w:p>
-      <w:pPr>
-        <w:spacing w:after="0" w:line="240" w:lineRule="auto"/>
-        <w:jc w:val="left"/>
-        <w:rPr>
-          <w:rFonts w:ascii="Times New Roman" w:eastAsia="Times New Roman" w:hAnsi="Times New Roman" w:cs="Times New Roman"/>
-          <w:sz w:val="24"/>
-          <w:szCs w:val="24"/>
-          <w:lang w:eastAsia="pt-BR"/>
-        </w:rPr>
-      </w:pPr>
-      <w:r>
-        <w:rPr>
-          <w:rFonts w:ascii="Times New Roman" w:eastAsia="Times New Roman" w:hAnsi="Times New Roman" w:cs="Times New Roman"/>
-          <w:noProof/>
-          <w:sz w:val="24"/>
-          <w:szCs w:val="24"/>
-          <w:lang w:eastAsia="pt-BR"/>
-          <w14:ligatures w14:val="standardContextual"/>
-        </w:rPr>
-        <w:pict w14:anchorId="2FA894E2">
-          <v:rect id="_x0000_i1025" alt="" style="width:425.2pt;height:.05pt;mso-width-percent:0;mso-height-percent:0;mso-width-percent:0;mso-height-percent:0" o:hralign="center" o:hrstd="t" o:hr="t" fillcolor="#a0a0a0" stroked="f"/>
-        </w:pict>
-      </w:r>
-    </w:p>
-    <w:p>
-      <w:pPr>
-        <w:spacing w:before="100" w:beforeAutospacing="1" w:after="100" w:afterAutospacing="1" w:line="240" w:lineRule="auto"/>
-        <w:jc w:val="left"/>
-        <w:outlineLvl w:val="1"/>
-        <w:rPr>
-          <w:rFonts w:ascii="Times New Roman" w:eastAsia="Times New Roman" w:hAnsi="Times New Roman" w:cs="Times New Roman"/>
-          <w:b/>
-          <w:bCs/>
-          <w:sz w:val="36"/>
-          <w:szCs w:val="36"/>
-          <w:lang w:eastAsia="pt-BR"/>
-        </w:rPr>
-      </w:pPr>
-      <w:r>
-        <w:rPr>
-          <w:rFonts w:ascii="Apple Color Emoji" w:eastAsia="Times New Roman" w:hAnsi="Apple Color Emoji" w:cs="Apple Color Emoji"/>
-          <w:b/>
-          <w:bCs/>
-          <w:sz w:val="36"/>
-          <w:szCs w:val="36"/>
-          <w:lang w:eastAsia="pt-BR"/>
-        </w:rPr>
-        <w:t>🚀</w:t>
-      </w:r>
-      <w:r>
-        <w:rPr>
-          <w:rFonts w:ascii="Times New Roman" w:eastAsia="Times New Roman" w:hAnsi="Times New Roman" w:cs="Times New Roman"/>
-          <w:b/>
-          <w:bCs/>
-          <w:sz w:val="36"/>
-          <w:szCs w:val="36"/>
-          <w:lang w:eastAsia="pt-BR"/>
-        </w:rPr>
-        <w:t xml:space="preserve"> Opção comando único</w:t>
-      </w:r>
-    </w:p>
-    <w:p>
-      <w:pPr>
-        <w:spacing w:before="100" w:beforeAutospacing="1" w:after="100" w:afterAutospacing="1" w:line="240" w:lineRule="auto"/>
-        <w:jc w:val="left"/>
-        <w:rPr>
-          <w:rFonts w:ascii="Times New Roman" w:eastAsia="Times New Roman" w:hAnsi="Times New Roman" w:cs="Times New Roman"/>
-          <w:sz w:val="24"/>
-          <w:szCs w:val="24"/>
-          <w:lang w:eastAsia="pt-BR"/>
-        </w:rPr>
-      </w:pPr>
-      <w:r>
-        <w:rPr>
-          <w:rFonts w:ascii="Times New Roman" w:eastAsia="Times New Roman" w:hAnsi="Times New Roman" w:cs="Times New Roman"/>
-          <w:sz w:val="24"/>
-          <w:szCs w:val="24"/>
-          <w:lang w:eastAsia="pt-BR"/>
-        </w:rPr>
-        <w:t>Use quando estiver confiante:</w:t>
+        <w:t>git add data/questoes.json html_final/data/questoes.json docs html_final/assets/app.js questoes_validadas_pdf md_criticos_reprocessados</w:t>
       </w:r>
     </w:p>
     <w:p>
@@ -1180,28 +1060,7 @@
           <w:szCs w:val="20"/>
           <w:lang w:eastAsia="pt-BR"/>
         </w:rPr>
-        <w:t>./deploy_seguro.sh</w:t>
-      </w:r>
-    </w:p>
-    <w:p>
-      <w:pPr>
-        <w:spacing w:before="100" w:beforeAutospacing="1" w:after="100" w:afterAutospacing="1" w:line="240" w:lineRule="auto"/>
-        <w:jc w:val="left"/>
-        <w:rPr>
-          <w:rFonts w:ascii="Times New Roman" w:eastAsia="Times New Roman" w:hAnsi="Times New Roman" w:cs="Times New Roman"/>
-          <w:sz w:val="24"/>
-          <w:szCs w:val="24"/>
-          <w:lang w:eastAsia="pt-BR"/>
-        </w:rPr>
-      </w:pPr>
-      <w:r>
-        <w:rPr>
-          <w:rFonts w:ascii="Times New Roman" w:eastAsia="Times New Roman" w:hAnsi="Times New Roman" w:cs="Times New Roman"/>
-          <w:sz w:val="24"/>
-          <w:szCs w:val="24"/>
-          <w:lang w:eastAsia="pt-BR"/>
-        </w:rPr>
-        <w:t>Ele faz:</w:t>
+        <w:t>git commit -m "Atualiza site com base validada"</w:t>
       </w:r>
     </w:p>
     <w:p>
@@ -1240,7 +1099,58 @@
           <w:szCs w:val="20"/>
           <w:lang w:eastAsia="pt-BR"/>
         </w:rPr>
-        <w:t>validação</w:t>
+        <w:t>git push origin main</w:t>
+      </w:r>
+    </w:p>
+    <w:p>
+      <w:pPr>
+        <w:spacing w:after="0" w:line="240" w:lineRule="auto"/>
+        <w:jc w:val="left"/>
+        <w:rPr>
+          <w:rFonts w:ascii="Times New Roman" w:eastAsia="Times New Roman" w:hAnsi="Times New Roman" w:cs="Times New Roman"/>
+          <w:sz w:val="24"/>
+          <w:szCs w:val="24"/>
+          <w:lang w:eastAsia="pt-BR"/>
+        </w:rPr>
+      </w:pPr>
+      <w:r>
+        <w:rPr>
+          <w:rFonts w:ascii="Times New Roman" w:eastAsia="Times New Roman" w:hAnsi="Times New Roman" w:cs="Times New Roman"/>
+          <w:noProof/>
+          <w:sz w:val="24"/>
+          <w:szCs w:val="24"/>
+          <w:lang w:eastAsia="pt-BR"/>
+          <w14:ligatures w14:val="standardContextual"/>
+        </w:rPr>
+        <w:pict w14:anchorId="7831DCAA">
+          <v:rect id="_x0000_i1034" alt="" style="width:425.2pt;height:.05pt;mso-width-percent:0;mso-height-percent:0;mso-width-percent:0;mso-height-percent:0" o:hralign="center" o:hrstd="t" o:hr="t" fillcolor="#a0a0a0" stroked="f"/>
+        </w:pict>
+      </w:r>
+    </w:p>
+    <w:p>
+      <w:pPr>
+        <w:spacing w:before="100" w:beforeAutospacing="1" w:after="100" w:afterAutospacing="1" w:line="240" w:lineRule="auto"/>
+        <w:jc w:val="left"/>
+        <w:outlineLvl w:val="1"/>
+        <w:rPr>
+          <w:rFonts w:ascii="Times New Roman" w:eastAsia="Times New Roman" w:hAnsi="Times New Roman" w:cs="Times New Roman"/>
+          <w:b/>
+          <w:bCs/>
+          <w:sz w:val="36"/>
+          <w:szCs w:val="36"/>
+          <w:lang w:eastAsia="pt-BR"/>
+        </w:rPr>
+      </w:pPr>
+      <w:r>
+        <w:rPr>
+          <w:rFonts w:ascii="Times New Roman" w:eastAsia="Times New Roman" w:hAnsi="Times New Roman" w:cs="Times New Roman"/>
+          <w:b/>
+          <w:bCs/>
+          <w:sz w:val="36"/>
+          <w:szCs w:val="36"/>
+          <w:lang w:eastAsia="pt-BR"/>
+        </w:rPr>
+        <w:t>Regra de ouro</w:t>
       </w:r>
     </w:p>
     <w:p>
@@ -1279,7 +1189,7 @@
           <w:szCs w:val="20"/>
           <w:lang w:eastAsia="pt-BR"/>
         </w:rPr>
-        <w:t>build</w:t>
+        <w:t>md_criticos_reprocessados = textos limpos estruturados</w:t>
       </w:r>
     </w:p>
     <w:p>
@@ -1318,7 +1228,7 @@
           <w:szCs w:val="20"/>
           <w:lang w:eastAsia="pt-BR"/>
         </w:rPr>
-        <w:t>git add</w:t>
+        <w:t>questoes_validadas_pdf = questões finais validadas</w:t>
       </w:r>
     </w:p>
     <w:p>
@@ -1357,7 +1267,7 @@
           <w:szCs w:val="20"/>
           <w:lang w:eastAsia="pt-BR"/>
         </w:rPr>
-        <w:t>commit</w:t>
+        <w:t>data/questoes.json = banco do app</w:t>
       </w:r>
     </w:p>
     <w:p>
@@ -1396,33 +1306,7 @@
           <w:szCs w:val="20"/>
           <w:lang w:eastAsia="pt-BR"/>
         </w:rPr>
-        <w:t>push</w:t>
-      </w:r>
-    </w:p>
-    <w:p>
-      <w:pPr>
-        <w:spacing w:before="100" w:beforeAutospacing="1" w:after="100" w:afterAutospacing="1" w:line="240" w:lineRule="auto"/>
-        <w:jc w:val="left"/>
-        <w:outlineLvl w:val="1"/>
-        <w:rPr>
-          <w:rFonts w:ascii="Times New Roman" w:eastAsia="Times New Roman" w:hAnsi="Times New Roman" w:cs="Times New Roman"/>
-          <w:b/>
-          <w:bCs/>
-          <w:sz w:val="36"/>
-          <w:szCs w:val="36"/>
-          <w:lang w:eastAsia="pt-BR"/>
-        </w:rPr>
-      </w:pPr>
-      <w:r>
-        <w:rPr>
-          <w:rFonts w:ascii="Times New Roman" w:eastAsia="Times New Roman" w:hAnsi="Times New Roman" w:cs="Times New Roman"/>
-          <w:b/>
-          <w:bCs/>
-          <w:sz w:val="36"/>
-          <w:szCs w:val="36"/>
-          <w:lang w:eastAsia="pt-BR"/>
-        </w:rPr>
-        <w:t>Regra de ouro</w:t>
+        <w:t>html_final = teste local</w:t>
       </w:r>
     </w:p>
     <w:p>
@@ -1461,7 +1345,46 @@
           <w:szCs w:val="20"/>
           <w:lang w:eastAsia="pt-BR"/>
         </w:rPr>
-        <w:t>md_criticos_reprocessados = textos limpos estruturados</w:t>
+        <w:t>docs = GitHub Pages</w:t>
+      </w:r>
+    </w:p>
+    <w:p>
+      <w:pPr>
+        <w:spacing w:before="100" w:beforeAutospacing="1" w:after="100" w:afterAutospacing="1" w:line="240" w:lineRule="auto"/>
+        <w:jc w:val="left"/>
+        <w:rPr>
+          <w:rFonts w:ascii="Times New Roman" w:eastAsia="Times New Roman" w:hAnsi="Times New Roman" w:cs="Times New Roman"/>
+          <w:sz w:val="24"/>
+          <w:szCs w:val="24"/>
+          <w:lang w:eastAsia="pt-BR"/>
+        </w:rPr>
+      </w:pPr>
+      <w:r>
+        <w:rPr>
+          <w:rFonts w:ascii="Times New Roman" w:eastAsia="Times New Roman" w:hAnsi="Times New Roman" w:cs="Times New Roman"/>
+          <w:sz w:val="24"/>
+          <w:szCs w:val="24"/>
+          <w:lang w:eastAsia="pt-BR"/>
+        </w:rPr>
+        <w:t xml:space="preserve">O seu </w:t>
+      </w:r>
+      <w:r>
+        <w:rPr>
+          <w:rFonts w:ascii="Courier New" w:eastAsia="Times New Roman" w:hAnsi="Courier New" w:cs="Courier New"/>
+          <w:sz w:val="20"/>
+          <w:szCs w:val="20"/>
+          <w:lang w:eastAsia="pt-BR"/>
+        </w:rPr>
+        <w:t>build.sh</w:t>
+      </w:r>
+      <w:r>
+        <w:rPr>
+          <w:rFonts w:ascii="Times New Roman" w:eastAsia="Times New Roman" w:hAnsi="Times New Roman" w:cs="Times New Roman"/>
+          <w:sz w:val="24"/>
+          <w:szCs w:val="24"/>
+          <w:lang w:eastAsia="pt-BR"/>
+        </w:rPr>
+        <w:t xml:space="preserve"> antigo virou, na prática:</w:t>
       </w:r>
     </w:p>
     <w:p>
@@ -1500,7 +1423,7 @@
           <w:szCs w:val="20"/>
           <w:lang w:eastAsia="pt-BR"/>
         </w:rPr>
-        <w:t>questoes_validadas_pdf = questões finais validadas</w:t>
+        <w:t>./preparar_docs_pages.sh</w:t>
       </w:r>
     </w:p>
     <w:p>
@@ -1532,153 +1455,6 @@
           <w:lang w:eastAsia="pt-BR"/>
         </w:rPr>
       </w:pPr>
-      <w:r>
-        <w:rPr>
-          <w:rFonts w:ascii="Courier New" w:eastAsia="Times New Roman" w:hAnsi="Courier New" w:cs="Courier New"/>
-          <w:sz w:val="20"/>
-          <w:szCs w:val="20"/>
-          <w:lang w:eastAsia="pt-BR"/>
-        </w:rPr>
-        <w:t>data/questoes.json = banco do app</w:t>
-      </w:r>
-    </w:p>
-    <w:p>
-      <w:pPr>
-        <w:tabs>
-          <w:tab w:val="left" w:pos="916"/>
-          <w:tab w:val="left" w:pos="1832"/>
-          <w:tab w:val="left" w:pos="2748"/>
-          <w:tab w:val="left" w:pos="3664"/>
-          <w:tab w:val="left" w:pos="4580"/>
-          <w:tab w:val="left" w:pos="5496"/>
-          <w:tab w:val="left" w:pos="6412"/>
-          <w:tab w:val="left" w:pos="7328"/>
-          <w:tab w:val="left" w:pos="8244"/>
-          <w:tab w:val="left" w:pos="9160"/>
-          <w:tab w:val="left" w:pos="10076"/>
-          <w:tab w:val="left" w:pos="10992"/>
-          <w:tab w:val="left" w:pos="11908"/>
-          <w:tab w:val="left" w:pos="12824"/>
-          <w:tab w:val="left" w:pos="13740"/>
-          <w:tab w:val="left" w:pos="14656"/>
-        </w:tabs>
-        <w:spacing w:after="0" w:line="240" w:lineRule="auto"/>
-        <w:jc w:val="left"/>
-        <w:rPr>
-          <w:rFonts w:ascii="Courier New" w:eastAsia="Times New Roman" w:hAnsi="Courier New" w:cs="Courier New"/>
-          <w:sz w:val="20"/>
-          <w:szCs w:val="20"/>
-          <w:lang w:eastAsia="pt-BR"/>
-        </w:rPr>
-      </w:pPr>
-      <w:r>
-        <w:rPr>
-          <w:rFonts w:ascii="Courier New" w:eastAsia="Times New Roman" w:hAnsi="Courier New" w:cs="Courier New"/>
-          <w:sz w:val="20"/>
-          <w:szCs w:val="20"/>
-          <w:lang w:eastAsia="pt-BR"/>
-        </w:rPr>
-        <w:t>html_final = teste local</w:t>
-      </w:r>
-    </w:p>
-    <w:p>
-      <w:pPr>
-        <w:tabs>
-          <w:tab w:val="left" w:pos="916"/>
-          <w:tab w:val="left" w:pos="1832"/>
-          <w:tab w:val="left" w:pos="2748"/>
-          <w:tab w:val="left" w:pos="3664"/>
-          <w:tab w:val="left" w:pos="4580"/>
-          <w:tab w:val="left" w:pos="5496"/>
-          <w:tab w:val="left" w:pos="6412"/>
-          <w:tab w:val="left" w:pos="7328"/>
-          <w:tab w:val="left" w:pos="8244"/>
-          <w:tab w:val="left" w:pos="9160"/>
-          <w:tab w:val="left" w:pos="10076"/>
-          <w:tab w:val="left" w:pos="10992"/>
-          <w:tab w:val="left" w:pos="11908"/>
-          <w:tab w:val="left" w:pos="12824"/>
-          <w:tab w:val="left" w:pos="13740"/>
-          <w:tab w:val="left" w:pos="14656"/>
-        </w:tabs>
-        <w:spacing w:after="0" w:line="240" w:lineRule="auto"/>
-        <w:jc w:val="left"/>
-        <w:rPr>
-          <w:rFonts w:ascii="Courier New" w:eastAsia="Times New Roman" w:hAnsi="Courier New" w:cs="Courier New"/>
-          <w:sz w:val="20"/>
-          <w:szCs w:val="20"/>
-          <w:lang w:eastAsia="pt-BR"/>
-        </w:rPr>
-      </w:pPr>
-      <w:r>
-        <w:rPr>
-          <w:rFonts w:ascii="Courier New" w:eastAsia="Times New Roman" w:hAnsi="Courier New" w:cs="Courier New"/>
-          <w:sz w:val="20"/>
-          <w:szCs w:val="20"/>
-          <w:lang w:eastAsia="pt-BR"/>
-        </w:rPr>
-        <w:t>docs = GitHub Pages</w:t>
-      </w:r>
-    </w:p>
-    <w:p>
-      <w:pPr>
-        <w:tabs>
-          <w:tab w:val="left" w:pos="916"/>
-          <w:tab w:val="left" w:pos="1832"/>
-          <w:tab w:val="left" w:pos="2748"/>
-          <w:tab w:val="left" w:pos="3664"/>
-          <w:tab w:val="left" w:pos="4580"/>
-          <w:tab w:val="left" w:pos="5496"/>
-          <w:tab w:val="left" w:pos="6412"/>
-          <w:tab w:val="left" w:pos="7328"/>
-          <w:tab w:val="left" w:pos="8244"/>
-          <w:tab w:val="left" w:pos="9160"/>
-          <w:tab w:val="left" w:pos="10076"/>
-          <w:tab w:val="left" w:pos="10992"/>
-          <w:tab w:val="left" w:pos="11908"/>
-          <w:tab w:val="left" w:pos="12824"/>
-          <w:tab w:val="left" w:pos="13740"/>
-          <w:tab w:val="left" w:pos="14656"/>
-        </w:tabs>
-        <w:spacing w:after="0" w:line="240" w:lineRule="auto"/>
-        <w:jc w:val="left"/>
-        <w:rPr>
-          <w:rFonts w:ascii="Courier New" w:eastAsia="Times New Roman" w:hAnsi="Courier New" w:cs="Courier New"/>
-          <w:sz w:val="20"/>
-          <w:szCs w:val="20"/>
-          <w:lang w:eastAsia="pt-BR"/>
-        </w:rPr>
-      </w:pPr>
-    </w:p>
-    <w:p>
-      <w:pPr>
-        <w:tabs>
-          <w:tab w:val="left" w:pos="916"/>
-          <w:tab w:val="left" w:pos="1832"/>
-          <w:tab w:val="left" w:pos="2748"/>
-          <w:tab w:val="left" w:pos="3664"/>
-          <w:tab w:val="left" w:pos="4580"/>
-          <w:tab w:val="left" w:pos="5496"/>
-          <w:tab w:val="left" w:pos="6412"/>
-          <w:tab w:val="left" w:pos="7328"/>
-          <w:tab w:val="left" w:pos="8244"/>
-          <w:tab w:val="left" w:pos="9160"/>
-          <w:tab w:val="left" w:pos="10076"/>
-          <w:tab w:val="left" w:pos="10992"/>
-          <w:tab w:val="left" w:pos="11908"/>
-          <w:tab w:val="left" w:pos="12824"/>
-          <w:tab w:val="left" w:pos="13740"/>
-          <w:tab w:val="left" w:pos="14656"/>
-        </w:tabs>
-        <w:spacing w:after="0" w:line="240" w:lineRule="auto"/>
-        <w:jc w:val="left"/>
-        <w:rPr>
-          <w:rFonts w:ascii="Courier New" w:eastAsia="Times New Roman" w:hAnsi="Courier New" w:cs="Courier New"/>
-          <w:sz w:val="20"/>
-          <w:szCs w:val="20"/>
-          <w:lang w:eastAsia="pt-BR"/>
-        </w:rPr>
-      </w:pPr>
     </w:p>
     <w:p>
       <w:pPr>
@@ -1725,7 +1501,29 @@
           <w:szCs w:val="26"/>
           <w:lang w:eastAsia="pt-BR"/>
         </w:rPr>
-        <w:t xml:space="preserve"> – não é da rotina. So quando cria modulo estranho:</w:t>
+        <w:t xml:space="preserve"> – não é da rotina. </w:t>
+      </w:r>
+      <w:r>
+        <w:rPr>
+          <w:rFonts w:ascii="Times New Roman" w:eastAsia="Times New Roman" w:hAnsi="Times New Roman" w:cs="Times New Roman"/>
+          <w:b/>
+          <w:bCs/>
+          <w:sz w:val="26"/>
+          <w:szCs w:val="26"/>
+          <w:lang w:eastAsia="pt-BR"/>
+        </w:rPr>
+        <w:t>Só</w:t>
+      </w:r>
+      <w:r>
+        <w:rPr>
+          <w:rFonts w:ascii="Times New Roman" w:eastAsia="Times New Roman" w:hAnsi="Times New Roman" w:cs="Times New Roman"/>
+          <w:b/>
+          <w:bCs/>
+          <w:sz w:val="26"/>
+          <w:szCs w:val="26"/>
+          <w:lang w:eastAsia="pt-BR"/>
+        </w:rPr>
+        <w:t xml:space="preserve"> quando cria modulo estranho:</w:t>
       </w:r>
     </w:p>
     <w:p>

</xml_diff>